<commit_message>
SAD template banner: each item on its own line in Word output
The header banner in public/templates/sad-template.{md,docx} was
rendering as one run-on paragraph in the Word doc, because Markdown
joins consecutive blockquote lines into a single paragraph at the
HTML/DOCX rendering stage even though the source has them separated.

Fix: insert empty blockquote markers ('>' with no content) between
each banner item. Pandoc then renders each as a separate paragraph
in the DOCX, with one blank line of vertical space between — readable
header instead of one wrapped block.

Tried trailing-backslash hard breaks first (Pandoc Markdown spec
syntax), but Pandoc didn't propagate them through to the .docx
output. Empty-blockquote-line approach is more reliable.

Verified: 5 banner items now render as 5 separate <w:p> paragraphs
in the Word doc (was 1 paragraph before).
</commit_message>
<xml_diff>
--- a/public/templates/sad-template.docx
+++ b/public/templates/sad-template.docx
@@ -36,9 +36,11 @@
       <w:r>
         <w:t xml:space="preserve">ADS v1.3.0 (Architecture Description Standard)</w:t>
       </w:r>
-      <w:r>
-        <w:t xml:space="preserve"> </w:t>
-      </w:r>
+    </w:p>
+    <w:p>
+      <w:pPr>
+        <w:pStyle w:val="BlockText"/>
+      </w:pPr>
       <w:r>
         <w:rPr>
           <w:b/>
@@ -52,9 +54,11 @@
       <w:r>
         <w:t xml:space="preserve">ArchStandard (archstandard.org)</w:t>
       </w:r>
-      <w:r>
-        <w:t xml:space="preserve"> </w:t>
-      </w:r>
+    </w:p>
+    <w:p>
+      <w:pPr>
+        <w:pStyle w:val="BlockText"/>
+      </w:pPr>
       <w:r>
         <w:rPr>
           <w:b/>
@@ -68,9 +72,11 @@
       <w:r>
         <w:t xml:space="preserve">CC BY 4.0 (https://creativecommons.org/licenses/by/4.0/)</w:t>
       </w:r>
-      <w:r>
-        <w:t xml:space="preserve"> </w:t>
-      </w:r>
+    </w:p>
+    <w:p>
+      <w:pPr>
+        <w:pStyle w:val="BlockText"/>
+      </w:pPr>
       <w:r>
         <w:rPr>
           <w:b/>

</xml_diff>